<commit_message>
Agrega pantallazos a los manuales, placeholder de evidencia de Andres, guion de presentacion y carpeta de entregables finales
</commit_message>
<xml_diff>
--- a/Entregas/Entrega 3/Pantallazos.docx
+++ b/Entregas/Entrega 3/Pantallazos.docx
@@ -3,14 +3,19 @@
 <w:document xmlns:wpc="http://schemas.microsoft.com/office/word/2010/wordprocessingCanvas" xmlns:cx="http://schemas.microsoft.com/office/drawing/2014/chartex" xmlns:cx1="http://schemas.microsoft.com/office/drawing/2015/9/8/chartex" xmlns:cx2="http://schemas.microsoft.com/office/drawing/2015/10/21/chartex" xmlns:cx3="http://schemas.microsoft.com/office/drawing/2016/5/9/chartex" xmlns:cx4="http://schemas.microsoft.com/office/drawing/2016/5/10/chartex" xmlns:cx5="http://schemas.microsoft.com/office/drawing/2016/5/11/chartex" xmlns:cx6="http://schemas.microsoft.com/office/drawing/2016/5/12/chartex" xmlns:cx7="http://schemas.microsoft.com/office/drawing/2016/5/13/chartex" xmlns:cx8="http://schemas.microsoft.com/office/drawing/2016/5/14/chartex" xmlns:mc="http://schemas.openxmlformats.org/markup-compatibility/2006" xmlns:aink="http://schemas.microsoft.com/office/drawing/2016/ink" xmlns:am3d="http://schemas.microsoft.com/office/drawing/2017/model3d" xmlns:o="urn:schemas-microsoft-com:office:office" xmlns:oel="http://schemas.microsoft.com/office/2019/extlst" xmlns:r="http://schemas.openxmlformats.org/officeDocument/2006/relationships" xmlns:m="http://schemas.openxmlformats.org/officeDocument/2006/math" xmlns:v="urn:schemas-microsoft-com:vml" xmlns:wp14="http://schemas.microsoft.com/office/word/2010/wordprocessingDrawing" xmlns:wp="http://schemas.openxmlformats.org/drawingml/2006/wordprocessingDrawing" xmlns:w10="urn:schemas-microsoft-com:office:word" xmlns:w="http://schemas.openxmlformats.org/wordprocessingml/2006/main" xmlns:w14="http://schemas.microsoft.com/office/word/2010/wordml" xmlns:w15="http://schemas.microsoft.com/office/word/2012/wordml" xmlns:w16cex="http://schemas.microsoft.com/office/word/2018/wordml/cex" xmlns:w16cid="http://schemas.microsoft.com/office/word/2016/wordml/cid" xmlns:w16="http://schemas.microsoft.com/office/word/2018/wordml" xmlns:w16du="http://schemas.microsoft.com/office/word/2023/wordml/word16du" xmlns:w16sdtdh="http://schemas.microsoft.com/office/word/2020/wordml/sdtdatahash" xmlns:w16sdtfl="http://schemas.microsoft.com/office/word/2024/wordml/sdtformatlock" xmlns:w16se="http://schemas.microsoft.com/office/word/2015/wordml/symex" xmlns:wpg="http://schemas.microsoft.com/office/word/2010/wordprocessingGroup" xmlns:wpi="http://schemas.microsoft.com/office/word/2010/wordprocessingInk" xmlns:wne="http://schemas.microsoft.com/office/word/2006/wordml" xmlns:wps="http://schemas.microsoft.com/office/word/2010/wordprocessingShape" mc:Ignorable="w14 w15 w16se w16cid w16 w16cex w16sdtdh w16sdtfl w16du wp14">
   <w:body>
     <w:p>
-      <w:pPr>
-        <w:jc w:val="center"/>
-      </w:pPr>
       <w:r>
         <w:drawing>
-          <wp:inline distT="0" distB="0" distL="0" distR="0" wp14:anchorId="494C363D" wp14:editId="1A39D3D3">
+          <wp:anchor distT="0" distB="0" distL="114300" distR="114300" simplePos="0" relativeHeight="251658240" behindDoc="0" locked="0" layoutInCell="1" allowOverlap="1" wp14:anchorId="494C363D" wp14:editId="06EF3FDC">
+            <wp:simplePos x="914400" y="457200"/>
+            <wp:positionH relativeFrom="column">
+              <wp:posOffset>914400</wp:posOffset>
+            </wp:positionH>
+            <wp:positionV relativeFrom="paragraph">
+              <wp:align>top</wp:align>
+            </wp:positionV>
             <wp:extent cx="5943600" cy="4080510"/>
             <wp:effectExtent l="0" t="0" r="0" b="0"/>
+            <wp:wrapSquare wrapText="bothSides"/>
             <wp:docPr id="591388144" name="Picture 1"/>
             <wp:cNvGraphicFramePr>
               <a:graphicFrameLocks xmlns:a="http://schemas.openxmlformats.org/drawingml/2006/main" noChangeAspect="1"/>
@@ -23,7 +28,13 @@
                     <pic:cNvPicPr/>
                   </pic:nvPicPr>
                   <pic:blipFill>
-                    <a:blip r:embed="rId4"/>
+                    <a:blip r:embed="rId4">
+                      <a:extLst>
+                        <a:ext uri="{28A0092B-C50C-407E-A947-70E740481C1C}">
+                          <a14:useLocalDpi xmlns:a14="http://schemas.microsoft.com/office/drawing/2010/main" val="0"/>
+                        </a:ext>
+                      </a:extLst>
+                    </a:blip>
                     <a:stretch>
                       <a:fillRect/>
                     </a:stretch>
@@ -40,8 +51,11 @@
                 </pic:pic>
               </a:graphicData>
             </a:graphic>
-          </wp:inline>
+          </wp:anchor>
         </w:drawing>
+      </w:r>
+      <w:r>
+        <w:br w:type="textWrapping" w:clear="all"/>
       </w:r>
     </w:p>
     <w:p>

</xml_diff>